<commit_message>
R3: examiner review, submission-readiness verdict, AI-assistance disclosure aligned with the review record, interval-coverage caveat in Ch. 5, rebuilt DOCX/PDF, deliverables index
Co-Authored-By: Claude Opus 5.5 <noreply@anthropic.com>
Claude-Session: https://claude.ai/code/session_01UXHEtWt2TConrWpwdXdEXW
</commit_message>
<xml_diff>
--- a/REM_FINAL_THESIS/CHAPTER2_LITERATURE_REVIEW_FINAL.docx
+++ b/REM_FINAL_THESIS/CHAPTER2_LITERATURE_REVIEW_FINAL.docx
@@ -2618,7 +2618,16 @@
         <w:pStyle w:val="FirstParagraph"/>
       </w:pPr>
       <w:r>
-        <w:t xml:space="preserve">Selection had two stages, both carried out by a single reviewer.</w:t>
+        <w:t xml:space="preserve">Selection had two stages, both carried out by a single reviewer: the thesis author, assisted by an AI coding assistant (Claude Code), as recorded in the search-strategy file (</w:t>
+      </w:r>
+      <w:r>
+        <w:rPr>
+          <w:rStyle w:val="VerbatimChar"/>
+        </w:rPr>
+        <w:t xml:space="preserve">CHAPTER2_SYSTEMATIC_SEARCH_STRATEGY.md</w:t>
+      </w:r>
+      <w:r>
+        <w:t xml:space="preserve">).</w:t>
       </w:r>
     </w:p>
     <w:p>
@@ -21772,13 +21781,13 @@
           <w:b/>
           <w:bCs/>
         </w:rPr>
-        <w:t xml:space="preserve">Single reviewer.</w:t>
-      </w:r>
-      <w:r>
-        <w:t xml:space="preserve"> </w:t>
-      </w:r>
-      <w:r>
-        <w:t xml:space="preserve">Screening, extraction and appraisal were each done by one person, with no second screener and no agreement statistic. The appraisal checklist is transparent but is not a validated risk-of-bias instrument.</w:t>
+        <w:t xml:space="preserve">Single reviewer, AI-assisted.</w:t>
+      </w:r>
+      <w:r>
+        <w:t xml:space="preserve"> </w:t>
+      </w:r>
+      <w:r>
+        <w:t xml:space="preserve">Screening, extraction and appraisal were each done by one reviewer, assisted by an AI coding assistant, with no independent second screener and no agreement statistic. The appraisal checklist is transparent but is not a validated risk-of-bias instrument.</w:t>
       </w:r>
     </w:p>
     <w:p>

</xml_diff>